<commit_message>
Submitting assignment 6-2 with repository link
</commit_message>
<xml_diff>
--- a/module-6/Contreras-movies-queries.docx
+++ b/module-6/Contreras-movies-queries.docx
@@ -68,7 +68,7 @@
           <w:bdr w:val="none" w:sz="0" w:space="0" w:color="auto" w:frame="1"/>
         </w:rPr>
         <w:drawing>
-          <wp:inline distT="0" distB="0" distL="0" distR="0" wp14:anchorId="690ACE5F" wp14:editId="275B4E36">
+          <wp:inline distT="0" distB="0" distL="0" distR="0" wp14:anchorId="690ACE5F" wp14:editId="7F68CEA7">
             <wp:extent cx="7791793" cy="4383716"/>
             <wp:effectExtent l="0" t="0" r="0" b="0"/>
             <wp:docPr id="80600720" name="Picture 1"/>
@@ -115,6 +115,22 @@
             </a:graphic>
           </wp:inline>
         </w:drawing>
+      </w:r>
+    </w:p>
+    <w:p>
+      <w:pPr>
+        <w:spacing w:after="160"/>
+      </w:pPr>
+      <w:r>
+        <w:t>Repository:</w:t>
+      </w:r>
+    </w:p>
+    <w:p>
+      <w:pPr>
+        <w:spacing w:after="160"/>
+      </w:pPr>
+      <w:r>
+        <w:t>https://github.com/fernandojosecc/csd-310</w:t>
       </w:r>
     </w:p>
     <w:p>

</xml_diff>